<commit_message>
ajout répertoire public, ajout .gitignore, package.json, readme
</commit_message>
<xml_diff>
--- a/documentation/0681407_healeyCoteMarieAndree_documentation.docx
+++ b/documentation/0681407_healeyCoteMarieAndree_documentation.docx
@@ -6,7 +6,7 @@
       <w:pPr>
         <w:jc w:val="center"/>
         <w:rPr>
-          <w:rFonts w:asciiTheme="minorHAnsi" w:hAnsiTheme="minorHAnsi" w:cstheme="minorHAnsi"/>
+          <w:rFonts w:asciiTheme="majorHAnsi" w:hAnsiTheme="majorHAnsi" w:cstheme="majorHAnsi"/>
         </w:rPr>
       </w:pPr>
     </w:p>
@@ -14,7 +14,7 @@
       <w:sdtPr>
         <w:rPr>
           <w:rStyle w:val="Style5"/>
-          <w:rFonts w:asciiTheme="minorHAnsi" w:hAnsiTheme="minorHAnsi" w:cstheme="minorHAnsi"/>
+          <w:rFonts w:asciiTheme="majorHAnsi" w:hAnsiTheme="majorHAnsi" w:cstheme="majorHAnsi"/>
         </w:rPr>
         <w:alias w:val="PRÉNOM NOM"/>
         <w:tag w:val="PRÉNOM NOM"/>
@@ -35,13 +35,13 @@
             <w:jc w:val="center"/>
             <w:rPr>
               <w:rStyle w:val="Style5"/>
-              <w:rFonts w:asciiTheme="minorHAnsi" w:hAnsiTheme="minorHAnsi" w:cstheme="minorHAnsi"/>
+              <w:rFonts w:asciiTheme="majorHAnsi" w:hAnsiTheme="majorHAnsi" w:cstheme="majorHAnsi"/>
             </w:rPr>
           </w:pPr>
           <w:r>
             <w:rPr>
               <w:rStyle w:val="Style5"/>
-              <w:rFonts w:asciiTheme="minorHAnsi" w:hAnsiTheme="minorHAnsi" w:cstheme="minorHAnsi"/>
+              <w:rFonts w:asciiTheme="majorHAnsi" w:hAnsiTheme="majorHAnsi" w:cstheme="majorHAnsi"/>
             </w:rPr>
             <w:t xml:space="preserve">Marie-andrée healey-côté </w:t>
           </w:r>
@@ -50,7 +50,7 @@
           <w:pPr>
             <w:jc w:val="center"/>
             <w:rPr>
-              <w:rFonts w:asciiTheme="minorHAnsi" w:hAnsiTheme="minorHAnsi" w:cstheme="minorHAnsi"/>
+              <w:rFonts w:asciiTheme="majorHAnsi" w:hAnsiTheme="majorHAnsi" w:cstheme="majorHAnsi"/>
               <w:caps/>
             </w:rPr>
           </w:pPr>
@@ -61,13 +61,13 @@
       <w:pPr>
         <w:jc w:val="center"/>
         <w:rPr>
-          <w:rFonts w:asciiTheme="minorHAnsi" w:hAnsiTheme="minorHAnsi" w:cstheme="minorHAnsi"/>
+          <w:rFonts w:asciiTheme="majorHAnsi" w:hAnsiTheme="majorHAnsi" w:cstheme="majorHAnsi"/>
         </w:rPr>
       </w:pPr>
       <w:sdt>
         <w:sdtPr>
           <w:rPr>
-            <w:rFonts w:asciiTheme="minorHAnsi" w:hAnsiTheme="minorHAnsi" w:cstheme="minorHAnsi"/>
+            <w:rFonts w:asciiTheme="majorHAnsi" w:hAnsiTheme="majorHAnsi" w:cstheme="majorHAnsi"/>
           </w:rPr>
           <w:alias w:val="Titre du cours"/>
           <w:tag w:val="Titre du cours"/>
@@ -79,7 +79,7 @@
         <w:sdtContent>
           <w:r>
             <w:rPr>
-              <w:rFonts w:asciiTheme="minorHAnsi" w:hAnsiTheme="minorHAnsi" w:cstheme="minorHAnsi"/>
+              <w:rFonts w:asciiTheme="majorHAnsi" w:hAnsiTheme="majorHAnsi" w:cstheme="majorHAnsi"/>
             </w:rPr>
             <w:t>Techniques avancées en programmation Web</w:t>
           </w:r>
@@ -90,31 +90,31 @@
       <w:pPr>
         <w:jc w:val="center"/>
         <w:rPr>
-          <w:rFonts w:asciiTheme="minorHAnsi" w:hAnsiTheme="minorHAnsi" w:cstheme="minorHAnsi"/>
-        </w:rPr>
-      </w:pPr>
-      <w:r>
-        <w:rPr>
-          <w:rFonts w:asciiTheme="minorHAnsi" w:hAnsiTheme="minorHAnsi" w:cstheme="minorHAnsi"/>
+          <w:rFonts w:asciiTheme="majorHAnsi" w:hAnsiTheme="majorHAnsi" w:cstheme="majorHAnsi"/>
+        </w:rPr>
+      </w:pPr>
+      <w:r>
+        <w:rPr>
+          <w:rFonts w:asciiTheme="majorHAnsi" w:hAnsiTheme="majorHAnsi" w:cstheme="majorHAnsi"/>
         </w:rPr>
         <w:t>582-41F-MA</w:t>
       </w:r>
       <w:r>
         <w:rPr>
-          <w:rFonts w:asciiTheme="minorHAnsi" w:hAnsiTheme="minorHAnsi" w:cstheme="minorHAnsi"/>
+          <w:rFonts w:asciiTheme="majorHAnsi" w:hAnsiTheme="majorHAnsi" w:cstheme="majorHAnsi"/>
         </w:rPr>
         <w:t xml:space="preserve"> </w:t>
       </w:r>
       <w:r>
         <w:rPr>
-          <w:rFonts w:asciiTheme="minorHAnsi" w:hAnsiTheme="minorHAnsi" w:cstheme="minorHAnsi"/>
+          <w:rFonts w:asciiTheme="majorHAnsi" w:hAnsiTheme="majorHAnsi" w:cstheme="majorHAnsi"/>
         </w:rPr>
         <w:t>gr.</w:t>
       </w:r>
       <w:sdt>
         <w:sdtPr>
           <w:rPr>
-            <w:rFonts w:asciiTheme="minorHAnsi" w:hAnsiTheme="minorHAnsi" w:cstheme="minorHAnsi"/>
+            <w:rFonts w:asciiTheme="majorHAnsi" w:hAnsiTheme="majorHAnsi" w:cstheme="majorHAnsi"/>
           </w:rPr>
           <w:alias w:val="no du groupe"/>
           <w:tag w:val="no du groupe"/>
@@ -126,7 +126,7 @@
         <w:sdtContent>
           <w:r>
             <w:rPr>
-              <w:rFonts w:asciiTheme="minorHAnsi" w:hAnsiTheme="minorHAnsi" w:cstheme="minorHAnsi"/>
+              <w:rFonts w:asciiTheme="majorHAnsi" w:hAnsiTheme="majorHAnsi" w:cstheme="majorHAnsi"/>
             </w:rPr>
             <w:t>24610</w:t>
           </w:r>
@@ -137,7 +137,7 @@
       <w:pPr>
         <w:jc w:val="center"/>
         <w:rPr>
-          <w:rFonts w:asciiTheme="minorHAnsi" w:hAnsiTheme="minorHAnsi" w:cstheme="minorHAnsi"/>
+          <w:rFonts w:asciiTheme="majorHAnsi" w:hAnsiTheme="majorHAnsi" w:cstheme="majorHAnsi"/>
         </w:rPr>
       </w:pPr>
     </w:p>
@@ -145,7 +145,7 @@
       <w:pPr>
         <w:jc w:val="center"/>
         <w:rPr>
-          <w:rFonts w:asciiTheme="minorHAnsi" w:hAnsiTheme="minorHAnsi" w:cstheme="minorHAnsi"/>
+          <w:rFonts w:asciiTheme="majorHAnsi" w:hAnsiTheme="majorHAnsi" w:cstheme="majorHAnsi"/>
         </w:rPr>
       </w:pPr>
     </w:p>
@@ -153,7 +153,7 @@
       <w:pPr>
         <w:jc w:val="center"/>
         <w:rPr>
-          <w:rFonts w:asciiTheme="minorHAnsi" w:hAnsiTheme="minorHAnsi" w:cstheme="minorHAnsi"/>
+          <w:rFonts w:asciiTheme="majorHAnsi" w:hAnsiTheme="majorHAnsi" w:cstheme="majorHAnsi"/>
         </w:rPr>
       </w:pPr>
     </w:p>
@@ -161,7 +161,7 @@
       <w:pPr>
         <w:jc w:val="center"/>
         <w:rPr>
-          <w:rFonts w:asciiTheme="minorHAnsi" w:hAnsiTheme="minorHAnsi" w:cstheme="minorHAnsi"/>
+          <w:rFonts w:asciiTheme="majorHAnsi" w:hAnsiTheme="majorHAnsi" w:cstheme="majorHAnsi"/>
         </w:rPr>
       </w:pPr>
     </w:p>
@@ -169,7 +169,7 @@
       <w:pPr>
         <w:jc w:val="center"/>
         <w:rPr>
-          <w:rFonts w:asciiTheme="minorHAnsi" w:hAnsiTheme="minorHAnsi" w:cstheme="minorHAnsi"/>
+          <w:rFonts w:asciiTheme="majorHAnsi" w:hAnsiTheme="majorHAnsi" w:cstheme="majorHAnsi"/>
         </w:rPr>
       </w:pPr>
     </w:p>
@@ -177,7 +177,7 @@
       <w:pPr>
         <w:jc w:val="center"/>
         <w:rPr>
-          <w:rFonts w:asciiTheme="minorHAnsi" w:hAnsiTheme="minorHAnsi" w:cstheme="minorHAnsi"/>
+          <w:rFonts w:asciiTheme="majorHAnsi" w:hAnsiTheme="majorHAnsi" w:cstheme="majorHAnsi"/>
           <w:b/>
         </w:rPr>
       </w:pPr>
@@ -185,7 +185,7 @@
         <w:sdtPr>
           <w:rPr>
             <w:rStyle w:val="Style2"/>
-            <w:rFonts w:asciiTheme="minorHAnsi" w:hAnsiTheme="minorHAnsi" w:cstheme="minorHAnsi"/>
+            <w:rFonts w:cstheme="majorHAnsi"/>
           </w:rPr>
           <w:alias w:val="TITRE"/>
           <w:tag w:val="TITRE"/>
@@ -205,13 +205,13 @@
           <w:r>
             <w:rPr>
               <w:rStyle w:val="Style2"/>
-              <w:rFonts w:asciiTheme="minorHAnsi" w:hAnsiTheme="minorHAnsi" w:cstheme="minorHAnsi"/>
+              <w:rFonts w:cstheme="majorHAnsi"/>
             </w:rPr>
             <w:t xml:space="preserve">Tp1 : </w:t>
           </w:r>
           <w:r>
             <w:rPr>
-              <w:rFonts w:asciiTheme="minorHAnsi" w:hAnsiTheme="minorHAnsi" w:cstheme="minorHAnsi"/>
+              <w:rFonts w:asciiTheme="majorHAnsi" w:hAnsiTheme="majorHAnsi" w:cstheme="majorHAnsi"/>
               <w:b/>
               <w:caps/>
             </w:rPr>
@@ -224,7 +224,7 @@
       <w:pPr>
         <w:jc w:val="center"/>
         <w:rPr>
-          <w:rFonts w:asciiTheme="minorHAnsi" w:hAnsiTheme="minorHAnsi" w:cstheme="minorHAnsi"/>
+          <w:rFonts w:asciiTheme="majorHAnsi" w:hAnsiTheme="majorHAnsi" w:cstheme="majorHAnsi"/>
           <w:b/>
         </w:rPr>
       </w:pPr>
@@ -233,7 +233,7 @@
       <w:pPr>
         <w:jc w:val="center"/>
         <w:rPr>
-          <w:rFonts w:asciiTheme="minorHAnsi" w:hAnsiTheme="minorHAnsi" w:cstheme="minorHAnsi"/>
+          <w:rFonts w:asciiTheme="majorHAnsi" w:hAnsiTheme="majorHAnsi" w:cstheme="majorHAnsi"/>
         </w:rPr>
       </w:pPr>
     </w:p>
@@ -241,7 +241,7 @@
       <w:pPr>
         <w:jc w:val="center"/>
         <w:rPr>
-          <w:rFonts w:asciiTheme="minorHAnsi" w:hAnsiTheme="minorHAnsi" w:cstheme="minorHAnsi"/>
+          <w:rFonts w:asciiTheme="majorHAnsi" w:hAnsiTheme="majorHAnsi" w:cstheme="majorHAnsi"/>
         </w:rPr>
       </w:pPr>
     </w:p>
@@ -249,7 +249,7 @@
       <w:pPr>
         <w:jc w:val="center"/>
         <w:rPr>
-          <w:rFonts w:asciiTheme="minorHAnsi" w:hAnsiTheme="minorHAnsi" w:cstheme="minorHAnsi"/>
+          <w:rFonts w:asciiTheme="majorHAnsi" w:hAnsiTheme="majorHAnsi" w:cstheme="majorHAnsi"/>
         </w:rPr>
       </w:pPr>
     </w:p>
@@ -257,7 +257,7 @@
       <w:pPr>
         <w:jc w:val="center"/>
         <w:rPr>
-          <w:rFonts w:asciiTheme="minorHAnsi" w:hAnsiTheme="minorHAnsi" w:cstheme="minorHAnsi"/>
+          <w:rFonts w:asciiTheme="majorHAnsi" w:hAnsiTheme="majorHAnsi" w:cstheme="majorHAnsi"/>
         </w:rPr>
       </w:pPr>
     </w:p>
@@ -265,7 +265,7 @@
       <w:pPr>
         <w:jc w:val="center"/>
         <w:rPr>
-          <w:rFonts w:asciiTheme="minorHAnsi" w:hAnsiTheme="minorHAnsi" w:cstheme="minorHAnsi"/>
+          <w:rFonts w:asciiTheme="majorHAnsi" w:hAnsiTheme="majorHAnsi" w:cstheme="majorHAnsi"/>
         </w:rPr>
       </w:pPr>
     </w:p>
@@ -273,12 +273,12 @@
       <w:pPr>
         <w:jc w:val="center"/>
         <w:rPr>
-          <w:rFonts w:asciiTheme="minorHAnsi" w:hAnsiTheme="minorHAnsi" w:cstheme="minorHAnsi"/>
-        </w:rPr>
-      </w:pPr>
-      <w:r>
-        <w:rPr>
-          <w:rFonts w:asciiTheme="minorHAnsi" w:hAnsiTheme="minorHAnsi" w:cstheme="minorHAnsi"/>
+          <w:rFonts w:asciiTheme="majorHAnsi" w:hAnsiTheme="majorHAnsi" w:cstheme="majorHAnsi"/>
+        </w:rPr>
+      </w:pPr>
+      <w:r>
+        <w:rPr>
+          <w:rFonts w:asciiTheme="majorHAnsi" w:hAnsiTheme="majorHAnsi" w:cstheme="majorHAnsi"/>
         </w:rPr>
         <w:t>Travail présenté à</w:t>
       </w:r>
@@ -287,13 +287,13 @@
       <w:pPr>
         <w:jc w:val="center"/>
         <w:rPr>
-          <w:rFonts w:asciiTheme="minorHAnsi" w:hAnsiTheme="minorHAnsi" w:cstheme="minorHAnsi"/>
+          <w:rFonts w:asciiTheme="majorHAnsi" w:hAnsiTheme="majorHAnsi" w:cstheme="majorHAnsi"/>
         </w:rPr>
       </w:pPr>
       <w:sdt>
         <w:sdtPr>
           <w:rPr>
-            <w:rFonts w:asciiTheme="minorHAnsi" w:hAnsiTheme="minorHAnsi" w:cstheme="minorHAnsi"/>
+            <w:rFonts w:asciiTheme="majorHAnsi" w:hAnsiTheme="majorHAnsi" w:cstheme="majorHAnsi"/>
           </w:rPr>
           <w:alias w:val="Mme M."/>
           <w:tag w:val="Mme M."/>
@@ -310,7 +310,7 @@
         <w:sdtContent>
           <w:r>
             <w:rPr>
-              <w:rFonts w:asciiTheme="minorHAnsi" w:hAnsiTheme="minorHAnsi" w:cstheme="minorHAnsi"/>
+              <w:rFonts w:asciiTheme="majorHAnsi" w:hAnsiTheme="majorHAnsi" w:cstheme="majorHAnsi"/>
             </w:rPr>
             <w:t>M.</w:t>
           </w:r>
@@ -318,14 +318,14 @@
       </w:sdt>
       <w:r>
         <w:rPr>
-          <w:rFonts w:asciiTheme="minorHAnsi" w:hAnsiTheme="minorHAnsi" w:cstheme="minorHAnsi"/>
+          <w:rFonts w:asciiTheme="majorHAnsi" w:hAnsiTheme="majorHAnsi" w:cstheme="majorHAnsi"/>
         </w:rPr>
         <w:t xml:space="preserve"> </w:t>
       </w:r>
       <w:sdt>
         <w:sdtPr>
           <w:rPr>
-            <w:rFonts w:asciiTheme="minorHAnsi" w:hAnsiTheme="minorHAnsi" w:cstheme="minorHAnsi"/>
+            <w:rFonts w:asciiTheme="majorHAnsi" w:hAnsiTheme="majorHAnsi" w:cstheme="majorHAnsi"/>
           </w:rPr>
           <w:alias w:val="Nom de l'enseignant"/>
           <w:tag w:val="Nom de l'enseignant"/>
@@ -337,7 +337,7 @@
         <w:sdtContent>
           <w:r>
             <w:rPr>
-              <w:rFonts w:asciiTheme="minorHAnsi" w:hAnsiTheme="minorHAnsi" w:cstheme="minorHAnsi"/>
+              <w:rFonts w:asciiTheme="majorHAnsi" w:hAnsiTheme="majorHAnsi" w:cstheme="majorHAnsi"/>
             </w:rPr>
             <w:t>Marcos Sanches</w:t>
           </w:r>
@@ -348,14 +348,14 @@
       <w:pPr>
         <w:jc w:val="center"/>
         <w:rPr>
-          <w:rFonts w:asciiTheme="minorHAnsi" w:hAnsiTheme="minorHAnsi" w:cstheme="minorHAnsi"/>
-        </w:rPr>
-      </w:pPr>
-    </w:p>
-    <w:p>
-      <w:pPr>
-        <w:rPr>
-          <w:rFonts w:asciiTheme="minorHAnsi" w:hAnsiTheme="minorHAnsi" w:cstheme="minorHAnsi"/>
+          <w:rFonts w:asciiTheme="majorHAnsi" w:hAnsiTheme="majorHAnsi" w:cstheme="majorHAnsi"/>
+        </w:rPr>
+      </w:pPr>
+    </w:p>
+    <w:p>
+      <w:pPr>
+        <w:rPr>
+          <w:rFonts w:asciiTheme="majorHAnsi" w:hAnsiTheme="majorHAnsi" w:cstheme="majorHAnsi"/>
         </w:rPr>
       </w:pPr>
     </w:p>
@@ -363,7 +363,7 @@
       <w:pPr>
         <w:jc w:val="center"/>
         <w:rPr>
-          <w:rFonts w:asciiTheme="minorHAnsi" w:hAnsiTheme="minorHAnsi" w:cstheme="minorHAnsi"/>
+          <w:rFonts w:asciiTheme="majorHAnsi" w:hAnsiTheme="majorHAnsi" w:cstheme="majorHAnsi"/>
         </w:rPr>
       </w:pPr>
     </w:p>
@@ -371,7 +371,7 @@
       <w:pPr>
         <w:jc w:val="center"/>
         <w:rPr>
-          <w:rFonts w:asciiTheme="minorHAnsi" w:hAnsiTheme="minorHAnsi" w:cstheme="minorHAnsi"/>
+          <w:rFonts w:asciiTheme="majorHAnsi" w:hAnsiTheme="majorHAnsi" w:cstheme="majorHAnsi"/>
         </w:rPr>
       </w:pPr>
     </w:p>
@@ -379,7 +379,7 @@
       <w:pPr>
         <w:jc w:val="center"/>
         <w:rPr>
-          <w:rFonts w:asciiTheme="minorHAnsi" w:hAnsiTheme="minorHAnsi" w:cstheme="minorHAnsi"/>
+          <w:rFonts w:asciiTheme="majorHAnsi" w:hAnsiTheme="majorHAnsi" w:cstheme="majorHAnsi"/>
         </w:rPr>
       </w:pPr>
     </w:p>
@@ -387,7 +387,7 @@
       <w:pPr>
         <w:jc w:val="center"/>
         <w:rPr>
-          <w:rFonts w:asciiTheme="minorHAnsi" w:hAnsiTheme="minorHAnsi" w:cstheme="minorHAnsi"/>
+          <w:rFonts w:asciiTheme="majorHAnsi" w:hAnsiTheme="majorHAnsi" w:cstheme="majorHAnsi"/>
         </w:rPr>
       </w:pPr>
     </w:p>
@@ -395,7 +395,7 @@
       <w:pPr>
         <w:jc w:val="center"/>
         <w:rPr>
-          <w:rFonts w:asciiTheme="minorHAnsi" w:hAnsiTheme="minorHAnsi" w:cstheme="minorHAnsi"/>
+          <w:rFonts w:asciiTheme="majorHAnsi" w:hAnsiTheme="majorHAnsi" w:cstheme="majorHAnsi"/>
         </w:rPr>
       </w:pPr>
     </w:p>
@@ -403,19 +403,19 @@
       <w:pPr>
         <w:jc w:val="center"/>
         <w:rPr>
-          <w:rFonts w:asciiTheme="minorHAnsi" w:hAnsiTheme="minorHAnsi" w:cstheme="minorHAnsi"/>
-        </w:rPr>
-      </w:pPr>
-      <w:r>
-        <w:rPr>
-          <w:rFonts w:asciiTheme="minorHAnsi" w:hAnsiTheme="minorHAnsi" w:cstheme="minorHAnsi"/>
+          <w:rFonts w:asciiTheme="majorHAnsi" w:hAnsiTheme="majorHAnsi" w:cstheme="majorHAnsi"/>
+        </w:rPr>
+      </w:pPr>
+      <w:r>
+        <w:rPr>
+          <w:rFonts w:asciiTheme="majorHAnsi" w:hAnsiTheme="majorHAnsi" w:cstheme="majorHAnsi"/>
         </w:rPr>
         <w:t xml:space="preserve">Département </w:t>
       </w:r>
       <w:sdt>
         <w:sdtPr>
           <w:rPr>
-            <w:rFonts w:asciiTheme="minorHAnsi" w:hAnsiTheme="minorHAnsi" w:cstheme="minorHAnsi"/>
+            <w:rFonts w:asciiTheme="majorHAnsi" w:hAnsiTheme="majorHAnsi" w:cstheme="majorHAnsi"/>
           </w:rPr>
           <w:alias w:val="de d'"/>
           <w:tag w:val="de d'"/>
@@ -432,7 +432,7 @@
         <w:sdtContent>
           <w:r>
             <w:rPr>
-              <w:rFonts w:asciiTheme="minorHAnsi" w:hAnsiTheme="minorHAnsi" w:cstheme="minorHAnsi"/>
+              <w:rFonts w:asciiTheme="majorHAnsi" w:hAnsiTheme="majorHAnsi" w:cstheme="majorHAnsi"/>
             </w:rPr>
             <w:t xml:space="preserve">de </w:t>
           </w:r>
@@ -441,7 +441,7 @@
       <w:sdt>
         <w:sdtPr>
           <w:rPr>
-            <w:rFonts w:asciiTheme="minorHAnsi" w:hAnsiTheme="minorHAnsi" w:cstheme="minorHAnsi"/>
+            <w:rFonts w:asciiTheme="majorHAnsi" w:hAnsiTheme="majorHAnsi" w:cstheme="majorHAnsi"/>
           </w:rPr>
           <w:alias w:val="nom du département"/>
           <w:tag w:val="nom du département"/>
@@ -453,7 +453,7 @@
         <w:sdtContent>
           <w:r>
             <w:rPr>
-              <w:rFonts w:asciiTheme="minorHAnsi" w:hAnsiTheme="minorHAnsi" w:cstheme="minorHAnsi"/>
+              <w:rFonts w:asciiTheme="majorHAnsi" w:hAnsiTheme="majorHAnsi" w:cstheme="majorHAnsi"/>
             </w:rPr>
             <w:t>Formation continue – Programme NWE.0F</w:t>
           </w:r>
@@ -464,12 +464,12 @@
       <w:pPr>
         <w:jc w:val="center"/>
         <w:rPr>
-          <w:rFonts w:asciiTheme="minorHAnsi" w:hAnsiTheme="minorHAnsi" w:cstheme="minorHAnsi"/>
-        </w:rPr>
-      </w:pPr>
-      <w:r>
-        <w:rPr>
-          <w:rFonts w:asciiTheme="minorHAnsi" w:hAnsiTheme="minorHAnsi" w:cstheme="minorHAnsi"/>
+          <w:rFonts w:asciiTheme="majorHAnsi" w:hAnsiTheme="majorHAnsi" w:cstheme="majorHAnsi"/>
+        </w:rPr>
+      </w:pPr>
+      <w:r>
+        <w:rPr>
+          <w:rFonts w:asciiTheme="majorHAnsi" w:hAnsiTheme="majorHAnsi" w:cstheme="majorHAnsi"/>
         </w:rPr>
         <w:t>Collège de Maisonneuve</w:t>
       </w:r>
@@ -478,19 +478,19 @@
       <w:pPr>
         <w:jc w:val="center"/>
         <w:rPr>
-          <w:rFonts w:asciiTheme="minorHAnsi" w:hAnsiTheme="minorHAnsi" w:cstheme="minorHAnsi"/>
-        </w:rPr>
-      </w:pPr>
-      <w:r>
-        <w:rPr>
-          <w:rFonts w:asciiTheme="minorHAnsi" w:hAnsiTheme="minorHAnsi" w:cstheme="minorHAnsi"/>
+          <w:rFonts w:asciiTheme="majorHAnsi" w:hAnsiTheme="majorHAnsi" w:cstheme="majorHAnsi"/>
+        </w:rPr>
+      </w:pPr>
+      <w:r>
+        <w:rPr>
+          <w:rFonts w:asciiTheme="majorHAnsi" w:hAnsiTheme="majorHAnsi" w:cstheme="majorHAnsi"/>
         </w:rPr>
         <w:t xml:space="preserve">Le </w:t>
       </w:r>
       <w:sdt>
         <w:sdtPr>
           <w:rPr>
-            <w:rFonts w:asciiTheme="minorHAnsi" w:hAnsiTheme="minorHAnsi" w:cstheme="minorHAnsi"/>
+            <w:rFonts w:asciiTheme="majorHAnsi" w:hAnsiTheme="majorHAnsi" w:cstheme="majorHAnsi"/>
           </w:rPr>
           <w:alias w:val="Date de la remise"/>
           <w:tag w:val="Date de la remise"/>
@@ -508,7 +508,7 @@
         <w:sdtContent>
           <w:r>
             <w:rPr>
-              <w:rFonts w:asciiTheme="minorHAnsi" w:hAnsiTheme="minorHAnsi" w:cstheme="minorHAnsi"/>
+              <w:rFonts w:asciiTheme="majorHAnsi" w:hAnsiTheme="majorHAnsi" w:cstheme="majorHAnsi"/>
             </w:rPr>
             <w:t>28 janvier 2026</w:t>
           </w:r>
@@ -518,6 +518,7 @@
     <w:sdt>
       <w:sdtPr>
         <w:rPr>
+          <w:rFonts w:cstheme="majorHAnsi"/>
           <w:lang w:val="fr-FR"/>
         </w:rPr>
         <w:id w:val="-1283338389"/>
@@ -528,7 +529,7 @@
       </w:sdtPr>
       <w:sdtEndPr>
         <w:rPr>
-          <w:rFonts w:ascii="Times New Roman" w:eastAsia="Times New Roman" w:hAnsi="Times New Roman" w:cs="Times New Roman"/>
+          <w:rFonts w:eastAsia="Times New Roman"/>
           <w:b/>
           <w:bCs/>
           <w:color w:val="auto"/>
@@ -540,9 +541,13 @@
         <w:p>
           <w:pPr>
             <w:pStyle w:val="En-ttedetabledesmatires"/>
+            <w:rPr>
+              <w:rFonts w:cstheme="majorHAnsi"/>
+            </w:rPr>
           </w:pPr>
           <w:r>
             <w:rPr>
+              <w:rFonts w:cstheme="majorHAnsi"/>
               <w:lang w:val="fr-FR"/>
             </w:rPr>
             <w:t>Table des matières</w:t>
@@ -555,31 +560,42 @@
               <w:tab w:val="right" w:leader="dot" w:pos="9396"/>
             </w:tabs>
             <w:rPr>
-              <w:rFonts w:asciiTheme="minorHAnsi" w:eastAsiaTheme="minorEastAsia" w:hAnsiTheme="minorHAnsi" w:cstheme="minorBidi"/>
+              <w:rFonts w:asciiTheme="majorHAnsi" w:eastAsiaTheme="minorEastAsia" w:hAnsiTheme="majorHAnsi" w:cstheme="majorHAnsi"/>
               <w:noProof/>
               <w:kern w:val="2"/>
               <w14:ligatures w14:val="standardContextual"/>
             </w:rPr>
           </w:pPr>
           <w:r>
+            <w:rPr>
+              <w:rFonts w:asciiTheme="majorHAnsi" w:hAnsiTheme="majorHAnsi" w:cstheme="majorHAnsi"/>
+            </w:rPr>
             <w:fldChar w:fldCharType="begin"/>
           </w:r>
           <w:r>
+            <w:rPr>
+              <w:rFonts w:asciiTheme="majorHAnsi" w:hAnsiTheme="majorHAnsi" w:cstheme="majorHAnsi"/>
+            </w:rPr>
             <w:instrText xml:space="preserve"> TOC \o "1-3" \h \z \u </w:instrText>
           </w:r>
           <w:r>
+            <w:rPr>
+              <w:rFonts w:asciiTheme="majorHAnsi" w:hAnsiTheme="majorHAnsi" w:cstheme="majorHAnsi"/>
+            </w:rPr>
             <w:fldChar w:fldCharType="separate"/>
           </w:r>
           <w:hyperlink w:anchor="_Toc220407597" w:history="1">
             <w:r>
               <w:rPr>
                 <w:rStyle w:val="Lienhypertexte"/>
+                <w:rFonts w:asciiTheme="majorHAnsi" w:hAnsiTheme="majorHAnsi" w:cstheme="majorHAnsi"/>
                 <w:noProof/>
               </w:rPr>
               <w:t>Brève description du projet</w:t>
             </w:r>
             <w:r>
               <w:rPr>
+                <w:rFonts w:asciiTheme="majorHAnsi" w:hAnsiTheme="majorHAnsi" w:cstheme="majorHAnsi"/>
                 <w:noProof/>
                 <w:webHidden/>
               </w:rPr>
@@ -587,6 +603,7 @@
             </w:r>
             <w:r>
               <w:rPr>
+                <w:rFonts w:asciiTheme="majorHAnsi" w:hAnsiTheme="majorHAnsi" w:cstheme="majorHAnsi"/>
                 <w:noProof/>
                 <w:webHidden/>
               </w:rPr>
@@ -594,6 +611,7 @@
             </w:r>
             <w:r>
               <w:rPr>
+                <w:rFonts w:asciiTheme="majorHAnsi" w:hAnsiTheme="majorHAnsi" w:cstheme="majorHAnsi"/>
                 <w:noProof/>
                 <w:webHidden/>
               </w:rPr>
@@ -601,12 +619,14 @@
             </w:r>
             <w:r>
               <w:rPr>
+                <w:rFonts w:asciiTheme="majorHAnsi" w:hAnsiTheme="majorHAnsi" w:cstheme="majorHAnsi"/>
                 <w:noProof/>
                 <w:webHidden/>
               </w:rPr>
             </w:r>
             <w:r>
               <w:rPr>
+                <w:rFonts w:asciiTheme="majorHAnsi" w:hAnsiTheme="majorHAnsi" w:cstheme="majorHAnsi"/>
                 <w:noProof/>
                 <w:webHidden/>
               </w:rPr>
@@ -614,6 +634,7 @@
             </w:r>
             <w:r>
               <w:rPr>
+                <w:rFonts w:asciiTheme="majorHAnsi" w:hAnsiTheme="majorHAnsi" w:cstheme="majorHAnsi"/>
                 <w:noProof/>
                 <w:webHidden/>
               </w:rPr>
@@ -621,6 +642,7 @@
             </w:r>
             <w:r>
               <w:rPr>
+                <w:rFonts w:asciiTheme="majorHAnsi" w:hAnsiTheme="majorHAnsi" w:cstheme="majorHAnsi"/>
                 <w:noProof/>
                 <w:webHidden/>
               </w:rPr>
@@ -635,7 +657,7 @@
               <w:tab w:val="right" w:leader="dot" w:pos="9396"/>
             </w:tabs>
             <w:rPr>
-              <w:rFonts w:asciiTheme="minorHAnsi" w:eastAsiaTheme="minorEastAsia" w:hAnsiTheme="minorHAnsi" w:cstheme="minorBidi"/>
+              <w:rFonts w:asciiTheme="majorHAnsi" w:eastAsiaTheme="minorEastAsia" w:hAnsiTheme="majorHAnsi" w:cstheme="majorHAnsi"/>
               <w:noProof/>
               <w:kern w:val="2"/>
               <w14:ligatures w14:val="standardContextual"/>
@@ -645,12 +667,14 @@
             <w:r>
               <w:rPr>
                 <w:rStyle w:val="Lienhypertexte"/>
+                <w:rFonts w:asciiTheme="majorHAnsi" w:hAnsiTheme="majorHAnsi" w:cstheme="majorHAnsi"/>
                 <w:noProof/>
               </w:rPr>
               <w:t>Commandes nécessaires à l’installation des bibliothèques utilisées</w:t>
             </w:r>
             <w:r>
               <w:rPr>
+                <w:rFonts w:asciiTheme="majorHAnsi" w:hAnsiTheme="majorHAnsi" w:cstheme="majorHAnsi"/>
                 <w:noProof/>
                 <w:webHidden/>
               </w:rPr>
@@ -658,6 +682,7 @@
             </w:r>
             <w:r>
               <w:rPr>
+                <w:rFonts w:asciiTheme="majorHAnsi" w:hAnsiTheme="majorHAnsi" w:cstheme="majorHAnsi"/>
                 <w:noProof/>
                 <w:webHidden/>
               </w:rPr>
@@ -665,6 +690,7 @@
             </w:r>
             <w:r>
               <w:rPr>
+                <w:rFonts w:asciiTheme="majorHAnsi" w:hAnsiTheme="majorHAnsi" w:cstheme="majorHAnsi"/>
                 <w:noProof/>
                 <w:webHidden/>
               </w:rPr>
@@ -672,12 +698,14 @@
             </w:r>
             <w:r>
               <w:rPr>
+                <w:rFonts w:asciiTheme="majorHAnsi" w:hAnsiTheme="majorHAnsi" w:cstheme="majorHAnsi"/>
                 <w:noProof/>
                 <w:webHidden/>
               </w:rPr>
             </w:r>
             <w:r>
               <w:rPr>
+                <w:rFonts w:asciiTheme="majorHAnsi" w:hAnsiTheme="majorHAnsi" w:cstheme="majorHAnsi"/>
                 <w:noProof/>
                 <w:webHidden/>
               </w:rPr>
@@ -685,6 +713,7 @@
             </w:r>
             <w:r>
               <w:rPr>
+                <w:rFonts w:asciiTheme="majorHAnsi" w:hAnsiTheme="majorHAnsi" w:cstheme="majorHAnsi"/>
                 <w:noProof/>
                 <w:webHidden/>
               </w:rPr>
@@ -692,6 +721,7 @@
             </w:r>
             <w:r>
               <w:rPr>
+                <w:rFonts w:asciiTheme="majorHAnsi" w:hAnsiTheme="majorHAnsi" w:cstheme="majorHAnsi"/>
                 <w:noProof/>
                 <w:webHidden/>
               </w:rPr>
@@ -706,7 +736,7 @@
               <w:tab w:val="right" w:leader="dot" w:pos="9396"/>
             </w:tabs>
             <w:rPr>
-              <w:rFonts w:asciiTheme="minorHAnsi" w:eastAsiaTheme="minorEastAsia" w:hAnsiTheme="minorHAnsi" w:cstheme="minorBidi"/>
+              <w:rFonts w:asciiTheme="majorHAnsi" w:eastAsiaTheme="minorEastAsia" w:hAnsiTheme="majorHAnsi" w:cstheme="majorHAnsi"/>
               <w:noProof/>
               <w:kern w:val="2"/>
               <w14:ligatures w14:val="standardContextual"/>
@@ -716,12 +746,14 @@
             <w:r>
               <w:rPr>
                 <w:rStyle w:val="Lienhypertexte"/>
+                <w:rFonts w:asciiTheme="majorHAnsi" w:hAnsiTheme="majorHAnsi" w:cstheme="majorHAnsi"/>
                 <w:noProof/>
               </w:rPr>
               <w:t>Commandes d’installation des dépendances</w:t>
             </w:r>
             <w:r>
               <w:rPr>
+                <w:rFonts w:asciiTheme="majorHAnsi" w:hAnsiTheme="majorHAnsi" w:cstheme="majorHAnsi"/>
                 <w:noProof/>
                 <w:webHidden/>
               </w:rPr>
@@ -729,6 +761,7 @@
             </w:r>
             <w:r>
               <w:rPr>
+                <w:rFonts w:asciiTheme="majorHAnsi" w:hAnsiTheme="majorHAnsi" w:cstheme="majorHAnsi"/>
                 <w:noProof/>
                 <w:webHidden/>
               </w:rPr>
@@ -736,6 +769,7 @@
             </w:r>
             <w:r>
               <w:rPr>
+                <w:rFonts w:asciiTheme="majorHAnsi" w:hAnsiTheme="majorHAnsi" w:cstheme="majorHAnsi"/>
                 <w:noProof/>
                 <w:webHidden/>
               </w:rPr>
@@ -743,12 +777,14 @@
             </w:r>
             <w:r>
               <w:rPr>
+                <w:rFonts w:asciiTheme="majorHAnsi" w:hAnsiTheme="majorHAnsi" w:cstheme="majorHAnsi"/>
                 <w:noProof/>
                 <w:webHidden/>
               </w:rPr>
             </w:r>
             <w:r>
               <w:rPr>
+                <w:rFonts w:asciiTheme="majorHAnsi" w:hAnsiTheme="majorHAnsi" w:cstheme="majorHAnsi"/>
                 <w:noProof/>
                 <w:webHidden/>
               </w:rPr>
@@ -756,6 +792,7 @@
             </w:r>
             <w:r>
               <w:rPr>
+                <w:rFonts w:asciiTheme="majorHAnsi" w:hAnsiTheme="majorHAnsi" w:cstheme="majorHAnsi"/>
                 <w:noProof/>
                 <w:webHidden/>
               </w:rPr>
@@ -763,6 +800,7 @@
             </w:r>
             <w:r>
               <w:rPr>
+                <w:rFonts w:asciiTheme="majorHAnsi" w:hAnsiTheme="majorHAnsi" w:cstheme="majorHAnsi"/>
                 <w:noProof/>
                 <w:webHidden/>
               </w:rPr>
@@ -777,7 +815,7 @@
               <w:tab w:val="right" w:leader="dot" w:pos="9396"/>
             </w:tabs>
             <w:rPr>
-              <w:rFonts w:asciiTheme="minorHAnsi" w:eastAsiaTheme="minorEastAsia" w:hAnsiTheme="minorHAnsi" w:cstheme="minorBidi"/>
+              <w:rFonts w:asciiTheme="majorHAnsi" w:eastAsiaTheme="minorEastAsia" w:hAnsiTheme="majorHAnsi" w:cstheme="majorHAnsi"/>
               <w:noProof/>
               <w:kern w:val="2"/>
               <w14:ligatures w14:val="standardContextual"/>
@@ -787,12 +825,14 @@
             <w:r>
               <w:rPr>
                 <w:rStyle w:val="Lienhypertexte"/>
+                <w:rFonts w:asciiTheme="majorHAnsi" w:hAnsiTheme="majorHAnsi" w:cstheme="majorHAnsi"/>
                 <w:noProof/>
               </w:rPr>
               <w:t>Instructions d’installation et d’exécution</w:t>
             </w:r>
             <w:r>
               <w:rPr>
+                <w:rFonts w:asciiTheme="majorHAnsi" w:hAnsiTheme="majorHAnsi" w:cstheme="majorHAnsi"/>
                 <w:noProof/>
                 <w:webHidden/>
               </w:rPr>
@@ -800,6 +840,7 @@
             </w:r>
             <w:r>
               <w:rPr>
+                <w:rFonts w:asciiTheme="majorHAnsi" w:hAnsiTheme="majorHAnsi" w:cstheme="majorHAnsi"/>
                 <w:noProof/>
                 <w:webHidden/>
               </w:rPr>
@@ -807,6 +848,7 @@
             </w:r>
             <w:r>
               <w:rPr>
+                <w:rFonts w:asciiTheme="majorHAnsi" w:hAnsiTheme="majorHAnsi" w:cstheme="majorHAnsi"/>
                 <w:noProof/>
                 <w:webHidden/>
               </w:rPr>
@@ -814,12 +856,14 @@
             </w:r>
             <w:r>
               <w:rPr>
+                <w:rFonts w:asciiTheme="majorHAnsi" w:hAnsiTheme="majorHAnsi" w:cstheme="majorHAnsi"/>
                 <w:noProof/>
                 <w:webHidden/>
               </w:rPr>
             </w:r>
             <w:r>
               <w:rPr>
+                <w:rFonts w:asciiTheme="majorHAnsi" w:hAnsiTheme="majorHAnsi" w:cstheme="majorHAnsi"/>
                 <w:noProof/>
                 <w:webHidden/>
               </w:rPr>
@@ -827,6 +871,7 @@
             </w:r>
             <w:r>
               <w:rPr>
+                <w:rFonts w:asciiTheme="majorHAnsi" w:hAnsiTheme="majorHAnsi" w:cstheme="majorHAnsi"/>
                 <w:noProof/>
                 <w:webHidden/>
               </w:rPr>
@@ -834,6 +879,7 @@
             </w:r>
             <w:r>
               <w:rPr>
+                <w:rFonts w:asciiTheme="majorHAnsi" w:hAnsiTheme="majorHAnsi" w:cstheme="majorHAnsi"/>
                 <w:noProof/>
                 <w:webHidden/>
               </w:rPr>
@@ -848,7 +894,7 @@
               <w:tab w:val="right" w:leader="dot" w:pos="9396"/>
             </w:tabs>
             <w:rPr>
-              <w:rFonts w:asciiTheme="minorHAnsi" w:eastAsiaTheme="minorEastAsia" w:hAnsiTheme="minorHAnsi" w:cstheme="minorBidi"/>
+              <w:rFonts w:asciiTheme="majorHAnsi" w:eastAsiaTheme="minorEastAsia" w:hAnsiTheme="majorHAnsi" w:cstheme="majorHAnsi"/>
               <w:noProof/>
               <w:kern w:val="2"/>
               <w14:ligatures w14:val="standardContextual"/>
@@ -858,12 +904,14 @@
             <w:r>
               <w:rPr>
                 <w:rStyle w:val="Lienhypertexte"/>
+                <w:rFonts w:asciiTheme="majorHAnsi" w:hAnsiTheme="majorHAnsi" w:cstheme="majorHAnsi"/>
                 <w:noProof/>
               </w:rPr>
               <w:t>Instructions d’installation et d’exécution</w:t>
             </w:r>
             <w:r>
               <w:rPr>
+                <w:rFonts w:asciiTheme="majorHAnsi" w:hAnsiTheme="majorHAnsi" w:cstheme="majorHAnsi"/>
                 <w:noProof/>
                 <w:webHidden/>
               </w:rPr>
@@ -871,6 +919,7 @@
             </w:r>
             <w:r>
               <w:rPr>
+                <w:rFonts w:asciiTheme="majorHAnsi" w:hAnsiTheme="majorHAnsi" w:cstheme="majorHAnsi"/>
                 <w:noProof/>
                 <w:webHidden/>
               </w:rPr>
@@ -878,6 +927,7 @@
             </w:r>
             <w:r>
               <w:rPr>
+                <w:rFonts w:asciiTheme="majorHAnsi" w:hAnsiTheme="majorHAnsi" w:cstheme="majorHAnsi"/>
                 <w:noProof/>
                 <w:webHidden/>
               </w:rPr>
@@ -885,12 +935,14 @@
             </w:r>
             <w:r>
               <w:rPr>
+                <w:rFonts w:asciiTheme="majorHAnsi" w:hAnsiTheme="majorHAnsi" w:cstheme="majorHAnsi"/>
                 <w:noProof/>
                 <w:webHidden/>
               </w:rPr>
             </w:r>
             <w:r>
               <w:rPr>
+                <w:rFonts w:asciiTheme="majorHAnsi" w:hAnsiTheme="majorHAnsi" w:cstheme="majorHAnsi"/>
                 <w:noProof/>
                 <w:webHidden/>
               </w:rPr>
@@ -898,6 +950,7 @@
             </w:r>
             <w:r>
               <w:rPr>
+                <w:rFonts w:asciiTheme="majorHAnsi" w:hAnsiTheme="majorHAnsi" w:cstheme="majorHAnsi"/>
                 <w:noProof/>
                 <w:webHidden/>
               </w:rPr>
@@ -905,6 +958,7 @@
             </w:r>
             <w:r>
               <w:rPr>
+                <w:rFonts w:asciiTheme="majorHAnsi" w:hAnsiTheme="majorHAnsi" w:cstheme="majorHAnsi"/>
                 <w:noProof/>
                 <w:webHidden/>
               </w:rPr>
@@ -919,7 +973,7 @@
               <w:tab w:val="right" w:leader="dot" w:pos="9396"/>
             </w:tabs>
             <w:rPr>
-              <w:rFonts w:asciiTheme="minorHAnsi" w:eastAsiaTheme="minorEastAsia" w:hAnsiTheme="minorHAnsi" w:cstheme="minorBidi"/>
+              <w:rFonts w:asciiTheme="majorHAnsi" w:eastAsiaTheme="minorEastAsia" w:hAnsiTheme="majorHAnsi" w:cstheme="majorHAnsi"/>
               <w:noProof/>
               <w:kern w:val="2"/>
               <w14:ligatures w14:val="standardContextual"/>
@@ -929,12 +983,14 @@
             <w:r>
               <w:rPr>
                 <w:rStyle w:val="Lienhypertexte"/>
+                <w:rFonts w:asciiTheme="majorHAnsi" w:hAnsiTheme="majorHAnsi" w:cstheme="majorHAnsi"/>
                 <w:noProof/>
               </w:rPr>
               <w:t>Lien vers votre dépôt GitHub</w:t>
             </w:r>
             <w:r>
               <w:rPr>
+                <w:rFonts w:asciiTheme="majorHAnsi" w:hAnsiTheme="majorHAnsi" w:cstheme="majorHAnsi"/>
                 <w:noProof/>
                 <w:webHidden/>
               </w:rPr>
@@ -942,6 +998,7 @@
             </w:r>
             <w:r>
               <w:rPr>
+                <w:rFonts w:asciiTheme="majorHAnsi" w:hAnsiTheme="majorHAnsi" w:cstheme="majorHAnsi"/>
                 <w:noProof/>
                 <w:webHidden/>
               </w:rPr>
@@ -949,6 +1006,7 @@
             </w:r>
             <w:r>
               <w:rPr>
+                <w:rFonts w:asciiTheme="majorHAnsi" w:hAnsiTheme="majorHAnsi" w:cstheme="majorHAnsi"/>
                 <w:noProof/>
                 <w:webHidden/>
               </w:rPr>
@@ -956,12 +1014,14 @@
             </w:r>
             <w:r>
               <w:rPr>
+                <w:rFonts w:asciiTheme="majorHAnsi" w:hAnsiTheme="majorHAnsi" w:cstheme="majorHAnsi"/>
                 <w:noProof/>
                 <w:webHidden/>
               </w:rPr>
             </w:r>
             <w:r>
               <w:rPr>
+                <w:rFonts w:asciiTheme="majorHAnsi" w:hAnsiTheme="majorHAnsi" w:cstheme="majorHAnsi"/>
                 <w:noProof/>
                 <w:webHidden/>
               </w:rPr>
@@ -969,6 +1029,7 @@
             </w:r>
             <w:r>
               <w:rPr>
+                <w:rFonts w:asciiTheme="majorHAnsi" w:hAnsiTheme="majorHAnsi" w:cstheme="majorHAnsi"/>
                 <w:noProof/>
                 <w:webHidden/>
               </w:rPr>
@@ -976,6 +1037,7 @@
             </w:r>
             <w:r>
               <w:rPr>
+                <w:rFonts w:asciiTheme="majorHAnsi" w:hAnsiTheme="majorHAnsi" w:cstheme="majorHAnsi"/>
                 <w:noProof/>
                 <w:webHidden/>
               </w:rPr>
@@ -984,8 +1046,14 @@
           </w:hyperlink>
         </w:p>
         <w:p>
+          <w:pPr>
+            <w:rPr>
+              <w:rFonts w:asciiTheme="majorHAnsi" w:hAnsiTheme="majorHAnsi" w:cstheme="majorHAnsi"/>
+            </w:rPr>
+          </w:pPr>
           <w:r>
             <w:rPr>
+              <w:rFonts w:asciiTheme="majorHAnsi" w:hAnsiTheme="majorHAnsi" w:cstheme="majorHAnsi"/>
               <w:b/>
               <w:bCs/>
               <w:lang w:val="fr-FR"/>
@@ -999,13 +1067,16 @@
       <w:pPr>
         <w:spacing w:after="160" w:line="259" w:lineRule="auto"/>
         <w:rPr>
-          <w:rFonts w:asciiTheme="majorHAnsi" w:eastAsiaTheme="majorEastAsia" w:hAnsiTheme="majorHAnsi" w:cstheme="majorBidi"/>
+          <w:rFonts w:asciiTheme="majorHAnsi" w:eastAsiaTheme="majorEastAsia" w:hAnsiTheme="majorHAnsi" w:cstheme="majorHAnsi"/>
           <w:color w:val="2F5496" w:themeColor="accent1" w:themeShade="BF"/>
           <w:sz w:val="40"/>
           <w:szCs w:val="40"/>
         </w:rPr>
       </w:pPr>
       <w:r>
+        <w:rPr>
+          <w:rFonts w:asciiTheme="majorHAnsi" w:hAnsiTheme="majorHAnsi" w:cstheme="majorHAnsi"/>
+        </w:rPr>
         <w:br w:type="page"/>
       </w:r>
     </w:p>
@@ -1013,24 +1084,27 @@
       <w:pPr>
         <w:pStyle w:val="Titre1"/>
         <w:rPr>
-          <w:rFonts w:eastAsia="Times New Roman"/>
+          <w:rFonts w:eastAsia="Times New Roman" w:cstheme="majorHAnsi"/>
         </w:rPr>
       </w:pPr>
       <w:bookmarkStart w:id="0" w:name="_Toc220407597"/>
       <w:r>
+        <w:rPr>
+          <w:rFonts w:cstheme="majorHAnsi"/>
+        </w:rPr>
         <w:lastRenderedPageBreak/>
         <w:t>Brève</w:t>
       </w:r>
       <w:r>
         <w:rPr>
-          <w:rFonts w:eastAsia="Times New Roman"/>
+          <w:rFonts w:eastAsia="Times New Roman" w:cstheme="majorHAnsi"/>
         </w:rPr>
         <w:t xml:space="preserve"> description du projet</w:t>
       </w:r>
       <w:bookmarkEnd w:id="0"/>
       <w:r>
         <w:rPr>
-          <w:rFonts w:eastAsia="Times New Roman"/>
+          <w:rFonts w:eastAsia="Times New Roman" w:cstheme="majorHAnsi"/>
         </w:rPr>
         <w:t xml:space="preserve"> </w:t>
       </w:r>
@@ -1108,64 +1182,45 @@
     </w:p>
     <w:p>
       <w:pPr>
-        <w:pStyle w:val="Titre1"/>
-        <w:rPr>
-          <w:rFonts w:eastAsia="Times New Roman"/>
+        <w:jc w:val="both"/>
+        <w:rPr>
+          <w:rFonts w:asciiTheme="majorHAnsi" w:hAnsiTheme="majorHAnsi" w:cstheme="majorHAnsi"/>
+        </w:rPr>
+      </w:pPr>
+    </w:p>
+    <w:p>
+      <w:pPr>
+        <w:jc w:val="both"/>
+        <w:rPr>
+          <w:rFonts w:asciiTheme="majorHAnsi" w:hAnsiTheme="majorHAnsi" w:cstheme="majorHAnsi"/>
+          <w:b/>
+          <w:bCs/>
+        </w:rPr>
+      </w:pPr>
+      <w:r>
+        <w:rPr>
+          <w:rFonts w:asciiTheme="majorHAnsi" w:hAnsiTheme="majorHAnsi" w:cstheme="majorHAnsi"/>
+          <w:b/>
+          <w:bCs/>
+        </w:rPr>
+        <w:t>Structure du projet</w:t>
+      </w:r>
+    </w:p>
+    <w:p>
+      <w:pPr>
+        <w:jc w:val="both"/>
+        <w:rPr>
+          <w:rFonts w:asciiTheme="majorHAnsi" w:hAnsiTheme="majorHAnsi" w:cstheme="majorHAnsi"/>
         </w:rPr>
       </w:pPr>
       <w:bookmarkStart w:id="1" w:name="_Toc220407598"/>
-      <w:r>
-        <w:t>C</w:t>
-      </w:r>
-      <w:r>
-        <w:t>ommandes nécessaires à l’installation</w:t>
-      </w:r>
-      <w:r>
-        <w:rPr>
-          <w:rFonts w:eastAsia="Times New Roman"/>
-        </w:rPr>
-        <w:t xml:space="preserve"> des bibliothèques utilisées</w:t>
-      </w:r>
-      <w:bookmarkEnd w:id="1"/>
-      <w:r>
-        <w:rPr>
-          <w:rFonts w:eastAsia="Times New Roman"/>
-        </w:rPr>
-        <w:t xml:space="preserve"> </w:t>
-      </w:r>
-    </w:p>
-    <w:p>
-      <w:pPr>
-        <w:ind w:firstLine="708"/>
-        <w:rPr>
-          <w:rFonts w:asciiTheme="majorHAnsi" w:hAnsiTheme="majorHAnsi" w:cstheme="majorHAnsi"/>
-        </w:rPr>
-      </w:pPr>
-      <w:r>
-        <w:rPr>
-          <w:rFonts w:asciiTheme="majorHAnsi" w:hAnsiTheme="majorHAnsi" w:cstheme="majorHAnsi"/>
-        </w:rPr>
-        <w:t xml:space="preserve">Ces commandes permettent de mettre en place un serveur Express fonctionnel, de gérer les variables sensibles via un fichier </w:t>
-      </w:r>
+      <w:proofErr w:type="spellStart"/>
       <w:proofErr w:type="gramStart"/>
       <w:r>
         <w:rPr>
           <w:rFonts w:asciiTheme="majorHAnsi" w:hAnsiTheme="majorHAnsi" w:cstheme="majorHAnsi"/>
         </w:rPr>
-        <w:t>« </w:t>
-      </w:r>
-      <w:r>
-        <w:rPr>
-          <w:rFonts w:asciiTheme="majorHAnsi" w:hAnsiTheme="majorHAnsi" w:cstheme="majorHAnsi"/>
-        </w:rPr>
-        <w:t>.</w:t>
-      </w:r>
-      <w:proofErr w:type="spellStart"/>
-      <w:r>
-        <w:rPr>
-          <w:rFonts w:asciiTheme="majorHAnsi" w:hAnsiTheme="majorHAnsi" w:cstheme="majorHAnsi"/>
-        </w:rPr>
-        <w:t>env</w:t>
+        <w:t>meteo</w:t>
       </w:r>
       <w:proofErr w:type="spellEnd"/>
       <w:proofErr w:type="gramEnd"/>
@@ -1173,6 +1228,487 @@
         <w:rPr>
           <w:rFonts w:asciiTheme="majorHAnsi" w:hAnsiTheme="majorHAnsi" w:cstheme="majorHAnsi"/>
         </w:rPr>
+        <w:t>-app/</w:t>
+      </w:r>
+    </w:p>
+    <w:p>
+      <w:pPr>
+        <w:jc w:val="both"/>
+        <w:rPr>
+          <w:rFonts w:asciiTheme="majorHAnsi" w:hAnsiTheme="majorHAnsi" w:cstheme="majorHAnsi"/>
+        </w:rPr>
+      </w:pPr>
+      <w:r>
+        <w:rPr>
+          <w:rFonts w:asciiTheme="majorHAnsi" w:hAnsiTheme="majorHAnsi" w:cstheme="majorHAnsi"/>
+        </w:rPr>
+        <w:t>│── data/                ← fichiers JSON générés par Express</w:t>
+      </w:r>
+    </w:p>
+    <w:p>
+      <w:pPr>
+        <w:jc w:val="both"/>
+        <w:rPr>
+          <w:rFonts w:asciiTheme="majorHAnsi" w:hAnsiTheme="majorHAnsi" w:cstheme="majorHAnsi"/>
+        </w:rPr>
+      </w:pPr>
+      <w:proofErr w:type="gramStart"/>
+      <w:r>
+        <w:rPr>
+          <w:rFonts w:asciiTheme="majorHAnsi" w:hAnsiTheme="majorHAnsi" w:cstheme="majorHAnsi"/>
+        </w:rPr>
+        <w:t>public</w:t>
+      </w:r>
+      <w:proofErr w:type="gramEnd"/>
+      <w:r>
+        <w:rPr>
+          <w:rFonts w:asciiTheme="majorHAnsi" w:hAnsiTheme="majorHAnsi" w:cstheme="majorHAnsi"/>
+        </w:rPr>
+        <w:t>/</w:t>
+      </w:r>
+      <w:r>
+        <w:rPr>
+          <w:rFonts w:asciiTheme="majorHAnsi" w:hAnsiTheme="majorHAnsi" w:cstheme="majorHAnsi"/>
+        </w:rPr>
+        <w:tab/>
+      </w:r>
+      <w:r>
+        <w:rPr>
+          <w:rFonts w:asciiTheme="majorHAnsi" w:hAnsiTheme="majorHAnsi" w:cstheme="majorHAnsi"/>
+        </w:rPr>
+        <w:tab/>
+      </w:r>
+      <w:r>
+        <w:rPr>
+          <w:rFonts w:asciiTheme="majorHAnsi" w:hAnsiTheme="majorHAnsi" w:cstheme="majorHAnsi"/>
+        </w:rPr>
+        <w:tab/>
+      </w:r>
+      <w:r>
+        <w:rPr>
+          <w:rFonts w:asciiTheme="majorHAnsi" w:hAnsiTheme="majorHAnsi" w:cstheme="majorHAnsi"/>
+        </w:rPr>
+        <w:t xml:space="preserve">← fichiers </w:t>
+      </w:r>
+      <w:r>
+        <w:rPr>
+          <w:rFonts w:asciiTheme="majorHAnsi" w:hAnsiTheme="majorHAnsi" w:cstheme="majorHAnsi"/>
+        </w:rPr>
+        <w:t>statiques</w:t>
+      </w:r>
+    </w:p>
+    <w:p>
+      <w:pPr>
+        <w:jc w:val="both"/>
+        <w:rPr>
+          <w:rFonts w:asciiTheme="majorHAnsi" w:hAnsiTheme="majorHAnsi" w:cstheme="majorHAnsi"/>
+          <w:lang w:val="en-CA"/>
+        </w:rPr>
+      </w:pPr>
+      <w:r>
+        <w:rPr>
+          <w:rFonts w:ascii="MS Gothic" w:eastAsia="MS Gothic" w:hAnsi="MS Gothic" w:cs="MS Gothic" w:hint="eastAsia"/>
+          <w:lang w:val="en-CA"/>
+        </w:rPr>
+        <w:t>├</w:t>
+      </w:r>
+      <w:r>
+        <w:rPr>
+          <w:rFonts w:ascii="Calibri Light" w:hAnsi="Calibri Light" w:cs="Calibri Light"/>
+          <w:lang w:val="en-CA"/>
+        </w:rPr>
+        <w:t>─</w:t>
+      </w:r>
+      <w:r>
+        <w:rPr>
+          <w:rFonts w:asciiTheme="majorHAnsi" w:hAnsiTheme="majorHAnsi" w:cstheme="majorHAnsi"/>
+          <w:lang w:val="en-CA"/>
+        </w:rPr>
+        <w:t xml:space="preserve"> index.html</w:t>
+      </w:r>
+    </w:p>
+    <w:p>
+      <w:pPr>
+        <w:jc w:val="both"/>
+        <w:rPr>
+          <w:rFonts w:asciiTheme="majorHAnsi" w:hAnsiTheme="majorHAnsi" w:cstheme="majorHAnsi"/>
+          <w:lang w:val="en-CA"/>
+        </w:rPr>
+      </w:pPr>
+      <w:r>
+        <w:rPr>
+          <w:rFonts w:ascii="MS Gothic" w:eastAsia="MS Gothic" w:hAnsi="MS Gothic" w:cs="MS Gothic" w:hint="eastAsia"/>
+          <w:lang w:val="en-CA"/>
+        </w:rPr>
+        <w:t>├</w:t>
+      </w:r>
+      <w:r>
+        <w:rPr>
+          <w:rFonts w:ascii="Calibri Light" w:hAnsi="Calibri Light" w:cs="Calibri Light"/>
+          <w:lang w:val="en-CA"/>
+        </w:rPr>
+        <w:t>─</w:t>
+      </w:r>
+      <w:r>
+        <w:rPr>
+          <w:rFonts w:asciiTheme="majorHAnsi" w:hAnsiTheme="majorHAnsi" w:cstheme="majorHAnsi"/>
+          <w:lang w:val="en-CA"/>
+        </w:rPr>
+        <w:t xml:space="preserve"> search.html</w:t>
+      </w:r>
+    </w:p>
+    <w:p>
+      <w:pPr>
+        <w:jc w:val="both"/>
+        <w:rPr>
+          <w:rFonts w:asciiTheme="majorHAnsi" w:hAnsiTheme="majorHAnsi" w:cstheme="majorHAnsi"/>
+          <w:lang w:val="en-CA"/>
+        </w:rPr>
+      </w:pPr>
+      <w:r>
+        <w:rPr>
+          <w:rFonts w:ascii="MS Gothic" w:eastAsia="MS Gothic" w:hAnsi="MS Gothic" w:cs="MS Gothic" w:hint="eastAsia"/>
+          <w:lang w:val="en-CA"/>
+        </w:rPr>
+        <w:t>├</w:t>
+      </w:r>
+      <w:r>
+        <w:rPr>
+          <w:rFonts w:ascii="Calibri Light" w:hAnsi="Calibri Light" w:cs="Calibri Light"/>
+          <w:lang w:val="en-CA"/>
+        </w:rPr>
+        <w:t>─</w:t>
+      </w:r>
+      <w:r>
+        <w:rPr>
+          <w:rFonts w:asciiTheme="majorHAnsi" w:hAnsiTheme="majorHAnsi" w:cstheme="majorHAnsi"/>
+          <w:lang w:val="en-CA"/>
+        </w:rPr>
+        <w:t xml:space="preserve"> contact.html</w:t>
+      </w:r>
+    </w:p>
+    <w:p>
+      <w:pPr>
+        <w:jc w:val="both"/>
+        <w:rPr>
+          <w:rFonts w:asciiTheme="majorHAnsi" w:hAnsiTheme="majorHAnsi" w:cstheme="majorHAnsi"/>
+          <w:lang w:val="en-CA"/>
+        </w:rPr>
+      </w:pPr>
+      <w:r>
+        <w:rPr>
+          <w:rFonts w:ascii="MS Gothic" w:eastAsia="MS Gothic" w:hAnsi="MS Gothic" w:cs="MS Gothic" w:hint="eastAsia"/>
+          <w:lang w:val="en-CA"/>
+        </w:rPr>
+        <w:t>├</w:t>
+      </w:r>
+      <w:r>
+        <w:rPr>
+          <w:rFonts w:ascii="Calibri Light" w:hAnsi="Calibri Light" w:cs="Calibri Light"/>
+          <w:lang w:val="en-CA"/>
+        </w:rPr>
+        <w:t>─</w:t>
+      </w:r>
+      <w:r>
+        <w:rPr>
+          <w:rFonts w:asciiTheme="majorHAnsi" w:hAnsiTheme="majorHAnsi" w:cstheme="majorHAnsi"/>
+          <w:lang w:val="en-CA"/>
+        </w:rPr>
+        <w:t xml:space="preserve"> assets/</w:t>
+      </w:r>
+    </w:p>
+    <w:p>
+      <w:pPr>
+        <w:jc w:val="both"/>
+        <w:rPr>
+          <w:rFonts w:asciiTheme="majorHAnsi" w:hAnsiTheme="majorHAnsi" w:cstheme="majorHAnsi"/>
+          <w:lang w:val="en-CA"/>
+        </w:rPr>
+      </w:pPr>
+      <w:proofErr w:type="gramStart"/>
+      <w:r>
+        <w:rPr>
+          <w:rFonts w:asciiTheme="majorHAnsi" w:hAnsiTheme="majorHAnsi" w:cstheme="majorHAnsi"/>
+          <w:lang w:val="en-CA"/>
+        </w:rPr>
+        <w:t xml:space="preserve">│  </w:t>
+      </w:r>
+      <w:r>
+        <w:rPr>
+          <w:rFonts w:ascii="MS Gothic" w:eastAsia="MS Gothic" w:hAnsi="MS Gothic" w:cs="MS Gothic" w:hint="eastAsia"/>
+          <w:lang w:val="en-CA"/>
+        </w:rPr>
+        <w:t>├</w:t>
+      </w:r>
+      <w:proofErr w:type="gramEnd"/>
+      <w:r>
+        <w:rPr>
+          <w:rFonts w:ascii="Calibri Light" w:hAnsi="Calibri Light" w:cs="Calibri Light"/>
+          <w:lang w:val="en-CA"/>
+        </w:rPr>
+        <w:t>─</w:t>
+      </w:r>
+      <w:r>
+        <w:rPr>
+          <w:rFonts w:asciiTheme="majorHAnsi" w:hAnsiTheme="majorHAnsi" w:cstheme="majorHAnsi"/>
+          <w:lang w:val="en-CA"/>
+        </w:rPr>
+        <w:t xml:space="preserve"> </w:t>
+      </w:r>
+      <w:proofErr w:type="spellStart"/>
+      <w:r>
+        <w:rPr>
+          <w:rFonts w:asciiTheme="majorHAnsi" w:hAnsiTheme="majorHAnsi" w:cstheme="majorHAnsi"/>
+          <w:lang w:val="en-CA"/>
+        </w:rPr>
+        <w:t>css</w:t>
+      </w:r>
+      <w:proofErr w:type="spellEnd"/>
+      <w:r>
+        <w:rPr>
+          <w:rFonts w:asciiTheme="majorHAnsi" w:hAnsiTheme="majorHAnsi" w:cstheme="majorHAnsi"/>
+          <w:lang w:val="en-CA"/>
+        </w:rPr>
+        <w:t>/</w:t>
+      </w:r>
+    </w:p>
+    <w:p>
+      <w:pPr>
+        <w:jc w:val="both"/>
+        <w:rPr>
+          <w:rFonts w:asciiTheme="majorHAnsi" w:hAnsiTheme="majorHAnsi" w:cstheme="majorHAnsi"/>
+          <w:lang w:val="en-CA"/>
+        </w:rPr>
+      </w:pPr>
+      <w:proofErr w:type="gramStart"/>
+      <w:r>
+        <w:rPr>
+          <w:rFonts w:asciiTheme="majorHAnsi" w:hAnsiTheme="majorHAnsi" w:cstheme="majorHAnsi"/>
+          <w:lang w:val="en-CA"/>
+        </w:rPr>
+        <w:t>│  │</w:t>
+      </w:r>
+      <w:proofErr w:type="gramEnd"/>
+      <w:r>
+        <w:rPr>
+          <w:rFonts w:asciiTheme="majorHAnsi" w:hAnsiTheme="majorHAnsi" w:cstheme="majorHAnsi"/>
+          <w:lang w:val="en-CA"/>
+        </w:rPr>
+        <w:t xml:space="preserve">  └─ style.css</w:t>
+      </w:r>
+    </w:p>
+    <w:p>
+      <w:pPr>
+        <w:jc w:val="both"/>
+        <w:rPr>
+          <w:rFonts w:asciiTheme="majorHAnsi" w:hAnsiTheme="majorHAnsi" w:cstheme="majorHAnsi"/>
+          <w:lang w:val="en-CA"/>
+        </w:rPr>
+      </w:pPr>
+      <w:proofErr w:type="gramStart"/>
+      <w:r>
+        <w:rPr>
+          <w:rFonts w:asciiTheme="majorHAnsi" w:hAnsiTheme="majorHAnsi" w:cstheme="majorHAnsi"/>
+          <w:lang w:val="en-CA"/>
+        </w:rPr>
+        <w:t>│  └</w:t>
+      </w:r>
+      <w:proofErr w:type="gramEnd"/>
+      <w:r>
+        <w:rPr>
+          <w:rFonts w:asciiTheme="majorHAnsi" w:hAnsiTheme="majorHAnsi" w:cstheme="majorHAnsi"/>
+          <w:lang w:val="en-CA"/>
+        </w:rPr>
+        <w:t xml:space="preserve">─ </w:t>
+      </w:r>
+      <w:proofErr w:type="spellStart"/>
+      <w:r>
+        <w:rPr>
+          <w:rFonts w:asciiTheme="majorHAnsi" w:hAnsiTheme="majorHAnsi" w:cstheme="majorHAnsi"/>
+          <w:lang w:val="en-CA"/>
+        </w:rPr>
+        <w:t>js</w:t>
+      </w:r>
+      <w:proofErr w:type="spellEnd"/>
+      <w:r>
+        <w:rPr>
+          <w:rFonts w:asciiTheme="majorHAnsi" w:hAnsiTheme="majorHAnsi" w:cstheme="majorHAnsi"/>
+          <w:lang w:val="en-CA"/>
+        </w:rPr>
+        <w:t>/</w:t>
+      </w:r>
+    </w:p>
+    <w:p>
+      <w:pPr>
+        <w:jc w:val="both"/>
+        <w:rPr>
+          <w:rFonts w:asciiTheme="majorHAnsi" w:hAnsiTheme="majorHAnsi" w:cstheme="majorHAnsi"/>
+          <w:lang w:val="en-CA"/>
+        </w:rPr>
+      </w:pPr>
+      <w:r>
+        <w:rPr>
+          <w:rFonts w:asciiTheme="majorHAnsi" w:hAnsiTheme="majorHAnsi" w:cstheme="majorHAnsi"/>
+          <w:lang w:val="en-CA"/>
+        </w:rPr>
+        <w:t>│     └─ script.js</w:t>
+      </w:r>
+    </w:p>
+    <w:p>
+      <w:pPr>
+        <w:jc w:val="both"/>
+        <w:rPr>
+          <w:rFonts w:asciiTheme="majorHAnsi" w:hAnsiTheme="majorHAnsi" w:cstheme="majorHAnsi"/>
+          <w:lang w:val="en-CA"/>
+        </w:rPr>
+      </w:pPr>
+      <w:r>
+        <w:rPr>
+          <w:rFonts w:asciiTheme="majorHAnsi" w:hAnsiTheme="majorHAnsi" w:cstheme="majorHAnsi"/>
+          <w:lang w:val="en-CA"/>
+        </w:rPr>
+        <w:t>│─</w:t>
+      </w:r>
+      <w:proofErr w:type="gramStart"/>
+      <w:r>
+        <w:rPr>
+          <w:rFonts w:asciiTheme="majorHAnsi" w:hAnsiTheme="majorHAnsi" w:cstheme="majorHAnsi"/>
+          <w:lang w:val="en-CA"/>
+        </w:rPr>
+        <w:t>─ .env</w:t>
+      </w:r>
+      <w:proofErr w:type="gramEnd"/>
+    </w:p>
+    <w:p>
+      <w:pPr>
+        <w:jc w:val="both"/>
+        <w:rPr>
+          <w:rFonts w:asciiTheme="majorHAnsi" w:hAnsiTheme="majorHAnsi" w:cstheme="majorHAnsi"/>
+          <w:lang w:val="en-CA"/>
+        </w:rPr>
+      </w:pPr>
+      <w:r>
+        <w:rPr>
+          <w:rFonts w:asciiTheme="majorHAnsi" w:hAnsiTheme="majorHAnsi" w:cstheme="majorHAnsi"/>
+          <w:lang w:val="en-CA"/>
+        </w:rPr>
+        <w:t>│── index.js</w:t>
+      </w:r>
+    </w:p>
+    <w:p>
+      <w:pPr>
+        <w:jc w:val="both"/>
+        <w:rPr>
+          <w:rFonts w:asciiTheme="majorHAnsi" w:hAnsiTheme="majorHAnsi" w:cstheme="majorHAnsi"/>
+          <w:lang w:val="en-CA"/>
+        </w:rPr>
+      </w:pPr>
+      <w:r>
+        <w:rPr>
+          <w:rFonts w:asciiTheme="majorHAnsi" w:hAnsiTheme="majorHAnsi" w:cstheme="majorHAnsi"/>
+          <w:lang w:val="en-CA"/>
+        </w:rPr>
+        <w:t xml:space="preserve">│── </w:t>
+      </w:r>
+      <w:proofErr w:type="spellStart"/>
+      <w:proofErr w:type="gramStart"/>
+      <w:r>
+        <w:rPr>
+          <w:rFonts w:asciiTheme="majorHAnsi" w:hAnsiTheme="majorHAnsi" w:cstheme="majorHAnsi"/>
+          <w:lang w:val="en-CA"/>
+        </w:rPr>
+        <w:t>package.json</w:t>
+      </w:r>
+      <w:proofErr w:type="spellEnd"/>
+      <w:proofErr w:type="gramEnd"/>
+    </w:p>
+    <w:p>
+      <w:pPr>
+        <w:jc w:val="both"/>
+        <w:rPr>
+          <w:rFonts w:asciiTheme="majorHAnsi" w:hAnsiTheme="majorHAnsi" w:cstheme="majorHAnsi"/>
+        </w:rPr>
+      </w:pPr>
+      <w:r>
+        <w:rPr>
+          <w:rFonts w:asciiTheme="majorHAnsi" w:hAnsiTheme="majorHAnsi" w:cstheme="majorHAnsi"/>
+        </w:rPr>
+        <w:t>│── README.md</w:t>
+      </w:r>
+    </w:p>
+    <w:p>
+      <w:pPr>
+        <w:pStyle w:val="Titre1"/>
+        <w:rPr>
+          <w:rFonts w:eastAsia="Times New Roman" w:cstheme="majorHAnsi"/>
+        </w:rPr>
+      </w:pPr>
+      <w:r>
+        <w:rPr>
+          <w:rFonts w:cstheme="majorHAnsi"/>
+        </w:rPr>
+        <w:lastRenderedPageBreak/>
+        <w:t>C</w:t>
+      </w:r>
+      <w:r>
+        <w:rPr>
+          <w:rFonts w:cstheme="majorHAnsi"/>
+        </w:rPr>
+        <w:t>ommandes nécessaires à l’installation</w:t>
+      </w:r>
+      <w:r>
+        <w:rPr>
+          <w:rFonts w:eastAsia="Times New Roman" w:cstheme="majorHAnsi"/>
+        </w:rPr>
+        <w:t xml:space="preserve"> des bibliothèques utilisées</w:t>
+      </w:r>
+      <w:bookmarkEnd w:id="1"/>
+      <w:r>
+        <w:rPr>
+          <w:rFonts w:eastAsia="Times New Roman" w:cstheme="majorHAnsi"/>
+        </w:rPr>
+        <w:t xml:space="preserve"> </w:t>
+      </w:r>
+    </w:p>
+    <w:p>
+      <w:pPr>
+        <w:ind w:firstLine="708"/>
+        <w:rPr>
+          <w:rFonts w:asciiTheme="majorHAnsi" w:hAnsiTheme="majorHAnsi" w:cstheme="majorHAnsi"/>
+        </w:rPr>
+      </w:pPr>
+      <w:r>
+        <w:rPr>
+          <w:rFonts w:asciiTheme="majorHAnsi" w:hAnsiTheme="majorHAnsi" w:cstheme="majorHAnsi"/>
+        </w:rPr>
+        <w:t xml:space="preserve">Ces commandes permettent de mettre en place un serveur Express fonctionnel, de gérer les variables sensibles via un fichier </w:t>
+      </w:r>
+      <w:proofErr w:type="gramStart"/>
+      <w:r>
+        <w:rPr>
+          <w:rFonts w:asciiTheme="majorHAnsi" w:hAnsiTheme="majorHAnsi" w:cstheme="majorHAnsi"/>
+        </w:rPr>
+        <w:t>« </w:t>
+      </w:r>
+      <w:r>
+        <w:rPr>
+          <w:rFonts w:asciiTheme="majorHAnsi" w:hAnsiTheme="majorHAnsi" w:cstheme="majorHAnsi"/>
+        </w:rPr>
+        <w:t>.</w:t>
+      </w:r>
+      <w:proofErr w:type="spellStart"/>
+      <w:r>
+        <w:rPr>
+          <w:rFonts w:asciiTheme="majorHAnsi" w:hAnsiTheme="majorHAnsi" w:cstheme="majorHAnsi"/>
+        </w:rPr>
+        <w:t>env</w:t>
+      </w:r>
+      <w:proofErr w:type="spellEnd"/>
+      <w:proofErr w:type="gramEnd"/>
+      <w:r>
+        <w:rPr>
+          <w:rFonts w:asciiTheme="majorHAnsi" w:hAnsiTheme="majorHAnsi" w:cstheme="majorHAnsi"/>
+        </w:rPr>
         <w:t> »</w:t>
       </w:r>
       <w:r>
@@ -1194,9 +1730,15 @@
     <w:p>
       <w:pPr>
         <w:pStyle w:val="Titre2"/>
+        <w:rPr>
+          <w:rFonts w:cstheme="majorHAnsi"/>
+        </w:rPr>
       </w:pPr>
       <w:bookmarkStart w:id="2" w:name="_Toc220407599"/>
       <w:r>
+        <w:rPr>
+          <w:rFonts w:cstheme="majorHAnsi"/>
+        </w:rPr>
         <w:t>Commandes d’installation des dépendances</w:t>
       </w:r>
       <w:bookmarkEnd w:id="2"/>
@@ -1630,29 +2172,32 @@
       <w:pPr>
         <w:pStyle w:val="Titre1"/>
         <w:rPr>
-          <w:rFonts w:eastAsia="Times New Roman"/>
-        </w:rPr>
-      </w:pPr>
-      <w:r>
-        <w:rPr>
-          <w:rFonts w:eastAsia="Times New Roman"/>
+          <w:rFonts w:eastAsia="Times New Roman" w:cstheme="majorHAnsi"/>
+        </w:rPr>
+      </w:pPr>
+      <w:r>
+        <w:rPr>
+          <w:rFonts w:eastAsia="Times New Roman" w:cstheme="majorHAnsi"/>
         </w:rPr>
         <w:t xml:space="preserve"> </w:t>
       </w:r>
       <w:bookmarkStart w:id="3" w:name="_Toc220407600"/>
       <w:r>
+        <w:rPr>
+          <w:rFonts w:cstheme="majorHAnsi"/>
+        </w:rPr>
         <w:t>I</w:t>
       </w:r>
       <w:r>
         <w:rPr>
-          <w:rFonts w:eastAsia="Times New Roman"/>
+          <w:rFonts w:eastAsia="Times New Roman" w:cstheme="majorHAnsi"/>
         </w:rPr>
         <w:t>nstructions d’installation et d’exécution</w:t>
       </w:r>
       <w:bookmarkEnd w:id="3"/>
       <w:r>
         <w:rPr>
-          <w:rFonts w:eastAsia="Times New Roman"/>
+          <w:rFonts w:eastAsia="Times New Roman" w:cstheme="majorHAnsi"/>
         </w:rPr>
         <w:t xml:space="preserve"> </w:t>
       </w:r>
@@ -1683,12 +2228,22 @@
     <w:p>
       <w:pPr>
         <w:pStyle w:val="Titre2"/>
+        <w:rPr>
+          <w:rFonts w:cstheme="majorHAnsi"/>
+        </w:rPr>
       </w:pPr>
       <w:bookmarkStart w:id="4" w:name="_Toc220407601"/>
       <w:r>
+        <w:rPr>
+          <w:rFonts w:cstheme="majorHAnsi"/>
+        </w:rPr>
+        <w:lastRenderedPageBreak/>
         <w:t>I</w:t>
       </w:r>
       <w:r>
+        <w:rPr>
+          <w:rFonts w:cstheme="majorHAnsi"/>
+        </w:rPr>
         <w:t>nstructions d’installation et d’exécution</w:t>
       </w:r>
       <w:bookmarkEnd w:id="4"/>
@@ -2080,38 +2635,52 @@
       <w:pPr>
         <w:pStyle w:val="Titre1"/>
         <w:rPr>
-          <w:rFonts w:eastAsia="Times New Roman"/>
+          <w:rFonts w:eastAsia="Times New Roman" w:cstheme="majorHAnsi"/>
         </w:rPr>
       </w:pPr>
       <w:bookmarkStart w:id="5" w:name="_Toc220407602"/>
       <w:r>
-        <w:lastRenderedPageBreak/>
+        <w:rPr>
+          <w:rFonts w:cstheme="majorHAnsi"/>
+        </w:rPr>
         <w:t>Lien</w:t>
       </w:r>
       <w:r>
         <w:rPr>
-          <w:rFonts w:eastAsia="Times New Roman"/>
+          <w:rFonts w:eastAsia="Times New Roman" w:cstheme="majorHAnsi"/>
         </w:rPr>
         <w:t xml:space="preserve"> vers votre dépôt GitHub</w:t>
       </w:r>
       <w:bookmarkEnd w:id="5"/>
       <w:r>
         <w:rPr>
-          <w:rFonts w:eastAsia="Times New Roman"/>
+          <w:rFonts w:eastAsia="Times New Roman" w:cstheme="majorHAnsi"/>
         </w:rPr>
         <w:t xml:space="preserve"> </w:t>
       </w:r>
     </w:p>
-    <w:p/>
-    <w:p>
-      <w:pPr>
-        <w:rPr>
-          <w:rFonts w:asciiTheme="minorHAnsi" w:hAnsiTheme="minorHAnsi" w:cstheme="minorHAnsi"/>
-        </w:rPr>
-      </w:pPr>
-      <w:r>
-        <w:rPr>
-          <w:rFonts w:asciiTheme="minorHAnsi" w:hAnsiTheme="minorHAnsi" w:cstheme="minorHAnsi"/>
+    <w:p>
+      <w:pPr>
+        <w:rPr>
+          <w:rFonts w:asciiTheme="majorHAnsi" w:hAnsiTheme="majorHAnsi" w:cstheme="majorHAnsi"/>
+        </w:rPr>
+      </w:pPr>
+    </w:p>
+    <w:p>
+      <w:pPr>
+        <w:rPr>
+          <w:rFonts w:asciiTheme="majorHAnsi" w:hAnsiTheme="majorHAnsi" w:cstheme="majorHAnsi"/>
+        </w:rPr>
+      </w:pPr>
+      <w:r>
+        <w:rPr>
+          <w:rFonts w:asciiTheme="majorHAnsi" w:hAnsiTheme="majorHAnsi" w:cstheme="majorHAnsi"/>
+        </w:rPr>
+        <w:t>https://github.com/marieAndreeHealeyCote/node.js_TP1/tree/main</w:t>
+      </w:r>
+      <w:r>
+        <w:rPr>
+          <w:rFonts w:asciiTheme="majorHAnsi" w:hAnsiTheme="majorHAnsi" w:cstheme="majorHAnsi"/>
         </w:rPr>
         <w:br/>
       </w:r>
@@ -4800,6 +5369,14 @@
     <w:pitch w:val="variable"/>
     <w:sig w:usb0="E4002EFF" w:usb1="C200247B" w:usb2="00000009" w:usb3="00000000" w:csb0="000001FF" w:csb1="00000000"/>
   </w:font>
+  <w:font w:name="MS Gothic">
+    <w:altName w:val="ＭＳ ゴシック"/>
+    <w:panose1 w:val="020B0609070205080204"/>
+    <w:charset w:val="80"/>
+    <w:family w:val="modern"/>
+    <w:pitch w:val="fixed"/>
+    <w:sig w:usb0="E00002FF" w:usb1="6AC7FDFB" w:usb2="08000012" w:usb3="00000000" w:csb0="0002009F" w:csb1="00000000"/>
+  </w:font>
 </w:fonts>
 </file>
 
@@ -4820,7 +5397,7 @@
   </w:compat>
   <w:rsids>
     <w:rsidRoot w:val="00F04BFD"/>
-    <w:rsid w:val="002E2B24"/>
+    <w:rsid w:val="007D6391"/>
     <w:rsid w:val="00F04BFD"/>
     <w:rsid w:val="00F61A83"/>
   </w:rsids>

</xml_diff>

<commit_message>
ajout pdf dans documentation
</commit_message>
<xml_diff>
--- a/documentation/0681407_healeyCoteMarieAndree_documentation.docx
+++ b/documentation/0681407_healeyCoteMarieAndree_documentation.docx
@@ -3127,7 +3127,7 @@
       </w:pPr>
       <w:r>
         <w:rPr>
-          <w:rFonts w:cstheme="majorHAnsi"/>
+          <w:rFonts w:asciiTheme="majorHAnsi" w:hAnsiTheme="majorHAnsi" w:cstheme="majorHAnsi"/>
         </w:rPr>
         <w:br w:type="page"/>
       </w:r>
@@ -8915,7 +8915,7 @@
   </w:compat>
   <w:rsids>
     <w:rsidRoot w:val="00F04BFD"/>
-    <w:rsid w:val="000421D5"/>
+    <w:rsid w:val="004C4D62"/>
     <w:rsid w:val="00F04BFD"/>
     <w:rsid w:val="00F61A83"/>
   </w:rsids>

</xml_diff>